<commit_message>
feat(ui): upgrade Al-Imam ke Diamond tier - glassmorphism, glowing shadows, feminine premium
</commit_message>
<xml_diff>
--- a/031- Pengumuman Hasil PSB 2026-2027 Kirim Pk Rieza (3).docx
+++ b/031- Pengumuman Hasil PSB 2026-2027 Kirim Pk Rieza (3).docx
@@ -1,6 +1,6 @@
 
 <file path=word/document.xml><?xml version="1.0" encoding="utf-8"?>
-<w:document xmlns:wpc="http://schemas.microsoft.com/office/word/2010/wordprocessingCanvas" xmlns:cx="http://schemas.microsoft.com/office/drawing/2014/chartex" xmlns:cx1="http://schemas.microsoft.com/office/drawing/2015/9/8/chartex" xmlns:cx2="http://schemas.microsoft.com/office/drawing/2015/10/21/chartex" xmlns:cx3="http://schemas.microsoft.com/office/drawing/2016/5/9/chartex" xmlns:cx4="http://schemas.microsoft.com/office/drawing/2016/5/10/chartex" xmlns:cx5="http://schemas.microsoft.com/office/drawing/2016/5/11/chartex" xmlns:cx6="http://schemas.microsoft.com/office/drawing/2016/5/12/chartex" xmlns:cx7="http://schemas.microsoft.com/office/drawing/2016/5/13/chartex" xmlns:cx8="http://schemas.microsoft.com/office/drawing/2016/5/14/chartex" xmlns:mc="http://schemas.openxmlformats.org/markup-compatibility/2006" xmlns:aink="http://schemas.microsoft.com/office/drawing/2016/ink" xmlns:am3d="http://schemas.microsoft.com/office/drawing/2017/model3d" xmlns:o="urn:schemas-microsoft-com:office:office" xmlns:r="http://schemas.openxmlformats.org/officeDocument/2006/relationships" xmlns:m="http://schemas.openxmlformats.org/officeDocument/2006/math" xmlns:v="urn:schemas-microsoft-com:vml" xmlns:wp14="http://schemas.microsoft.com/office/word/2010/wordprocessingDrawing" xmlns:wp="http://schemas.openxmlformats.org/drawingml/2006/wordprocessingDrawing" xmlns:w10="urn:schemas-microsoft-com:office:word" xmlns:w="http://schemas.openxmlformats.org/wordprocessingml/2006/main" xmlns:w14="http://schemas.microsoft.com/office/word/2010/wordml" xmlns:w15="http://schemas.microsoft.com/office/word/2012/wordml" xmlns:w16cex="http://schemas.microsoft.com/office/word/2018/wordml/cex" xmlns:w16cid="http://schemas.microsoft.com/office/word/2016/wordml/cid" xmlns:w16="http://schemas.microsoft.com/office/word/2018/wordml" xmlns:w16se="http://schemas.microsoft.com/office/word/2015/wordml/symex" xmlns:wpg="http://schemas.microsoft.com/office/word/2010/wordprocessingGroup" xmlns:wpi="http://schemas.microsoft.com/office/word/2010/wordprocessingInk" xmlns:wne="http://schemas.microsoft.com/office/word/2006/wordml" xmlns:wps="http://schemas.microsoft.com/office/word/2010/wordprocessingShape" xmlns:a="http://schemas.openxmlformats.org/drawingml/2006/main" xmlns:pic="http://schemas.openxmlformats.org/drawingml/2006/picture" xmlns:a14="http://schemas.microsoft.com/office/drawing/2010/main" mc:Ignorable="w14 w15 w16se w16cid w16 w16cex wp14">
+<w:document xmlns:wpc="http://schemas.microsoft.com/office/word/2010/wordprocessingCanvas" xmlns:cx="http://schemas.microsoft.com/office/drawing/2014/chartex" xmlns:cx1="http://schemas.microsoft.com/office/drawing/2015/9/8/chartex" xmlns:cx2="http://schemas.microsoft.com/office/drawing/2015/10/21/chartex" xmlns:cx3="http://schemas.microsoft.com/office/drawing/2016/5/9/chartex" xmlns:cx4="http://schemas.microsoft.com/office/drawing/2016/5/10/chartex" xmlns:cx5="http://schemas.microsoft.com/office/drawing/2016/5/11/chartex" xmlns:cx6="http://schemas.microsoft.com/office/drawing/2016/5/12/chartex" xmlns:cx7="http://schemas.microsoft.com/office/drawing/2016/5/13/chartex" xmlns:cx8="http://schemas.microsoft.com/office/drawing/2016/5/14/chartex" xmlns:mc="http://schemas.openxmlformats.org/markup-compatibility/2006" xmlns:aink="http://schemas.microsoft.com/office/drawing/2016/ink" xmlns:am3d="http://schemas.microsoft.com/office/drawing/2017/model3d" xmlns:o="urn:schemas-microsoft-com:office:office" xmlns:oel="http://schemas.microsoft.com/office/2019/extlst" xmlns:r="http://schemas.openxmlformats.org/officeDocument/2006/relationships" xmlns:m="http://schemas.openxmlformats.org/officeDocument/2006/math" xmlns:v="urn:schemas-microsoft-com:vml" xmlns:wp14="http://schemas.microsoft.com/office/word/2010/wordprocessingDrawing" xmlns:wp="http://schemas.openxmlformats.org/drawingml/2006/wordprocessingDrawing" xmlns:w10="urn:schemas-microsoft-com:office:word" xmlns:w="http://schemas.openxmlformats.org/wordprocessingml/2006/main" xmlns:w14="http://schemas.microsoft.com/office/word/2010/wordml" xmlns:w15="http://schemas.microsoft.com/office/word/2012/wordml" xmlns:w16cex="http://schemas.microsoft.com/office/word/2018/wordml/cex" xmlns:w16cid="http://schemas.microsoft.com/office/word/2016/wordml/cid" xmlns:w16="http://schemas.microsoft.com/office/word/2018/wordml" xmlns:w16sdtdh="http://schemas.microsoft.com/office/word/2020/wordml/sdtdatahash" xmlns:w16se="http://schemas.microsoft.com/office/word/2015/wordml/symex" xmlns:wpg="http://schemas.microsoft.com/office/word/2010/wordprocessingGroup" xmlns:wpi="http://schemas.microsoft.com/office/word/2010/wordprocessingInk" xmlns:wne="http://schemas.microsoft.com/office/word/2006/wordml" xmlns:wps="http://schemas.microsoft.com/office/word/2010/wordprocessingShape" mc:Ignorable="w14 w15 w16se w16cid w16 w16cex w16sdtdh wp14">
   <w:body>
     <w:p>
       <w:pPr>
@@ -109,146 +109,43 @@
         <w:t xml:space="preserve">: </w:t>
       </w:r>
       <w:r>
+        <w:t>012</w:t>
+      </w:r>
+      <w:r>
         <w:rPr>
           <w:b w:val="0"/>
           <w:bCs w:val="0"/>
         </w:rPr>
-        <w:fldChar w:fldCharType="begin"/>
-      </w:r>
-      <w:r>
-        <w:rPr>
-          <w:b w:val="0"/>
-          <w:bCs w:val="0"/>
-        </w:rPr>
-        <w:instrText xml:space="preserve"> MERGEFIELD No_Surt </w:instrText>
-      </w:r>
-      <w:r>
-        <w:rPr>
-          <w:b w:val="0"/>
-          <w:bCs w:val="0"/>
-        </w:rPr>
-        <w:fldChar w:fldCharType="separate"/>
-      </w:r>
-      <w:r>
-        <w:rPr>
-          <w:noProof/>
-        </w:rPr>
-        <w:t>031</w:t>
-      </w:r>
-      <w:r>
-        <w:rPr>
-          <w:b w:val="0"/>
-          <w:bCs w:val="0"/>
-        </w:rPr>
-        <w:fldChar w:fldCharType="end"/>
-      </w:r>
-      <w:r>
-        <w:rPr>
-          <w:b w:val="0"/>
-          <w:bCs w:val="0"/>
-        </w:rPr>
         <w:t>-</w:t>
       </w:r>
       <w:r>
-        <w:rPr>
-          <w:b w:val="0"/>
-          <w:bCs w:val="0"/>
-        </w:rPr>
-        <w:fldChar w:fldCharType="begin"/>
-      </w:r>
-      <w:r>
-        <w:rPr>
-          <w:b w:val="0"/>
-          <w:bCs w:val="0"/>
-        </w:rPr>
-        <w:instrText xml:space="preserve"> MERGEFIELD Kode </w:instrText>
-      </w:r>
-      <w:r>
-        <w:rPr>
-          <w:b w:val="0"/>
-          <w:bCs w:val="0"/>
-        </w:rPr>
-        <w:fldChar w:fldCharType="separate"/>
-      </w:r>
-      <w:r>
-        <w:rPr>
-          <w:noProof/>
-        </w:rPr>
-        <w:t>G</w:t>
-      </w:r>
-      <w:r>
-        <w:rPr>
-          <w:b w:val="0"/>
-          <w:bCs w:val="0"/>
-        </w:rPr>
-        <w:fldChar w:fldCharType="end"/>
-      </w:r>
-      <w:r>
-        <w:rPr>
-          <w:b w:val="0"/>
-          <w:bCs w:val="0"/>
-        </w:rPr>
-        <w:fldChar w:fldCharType="begin"/>
-      </w:r>
-      <w:r>
-        <w:rPr>
-          <w:b w:val="0"/>
-          <w:bCs w:val="0"/>
-        </w:rPr>
-        <w:instrText xml:space="preserve"> MERGEFIELD kode_2 </w:instrText>
-      </w:r>
-      <w:r>
-        <w:rPr>
-          <w:b w:val="0"/>
-          <w:bCs w:val="0"/>
-        </w:rPr>
-        <w:fldChar w:fldCharType="separate"/>
-      </w:r>
-      <w:r>
-        <w:rPr>
-          <w:noProof/>
-        </w:rPr>
-        <w:t>F</w:t>
-      </w:r>
-      <w:r>
-        <w:rPr>
-          <w:b w:val="0"/>
-          <w:bCs w:val="0"/>
-        </w:rPr>
-        <w:fldChar w:fldCharType="end"/>
-      </w:r>
-      <w:r>
-        <w:rPr/>
-        <w:t>/PP</w:t>
-      </w:r>
-      <w:r>
-        <w:rPr/>
+        <w:t>A</w:t>
+      </w:r>
+      <w:r>
+        <w:t>B</w:t>
+      </w:r>
+      <w:r>
+        <w:t>/P</w:t>
+      </w:r>
+      <w:r>
         <w:t>S</w:t>
       </w:r>
       <w:r>
-        <w:rPr/>
         <w:t>B-</w:t>
       </w:r>
       <w:r>
-        <w:rPr/>
         <w:t>PUAS</w:t>
       </w:r>
       <w:r>
-        <w:rPr/>
         <w:t>/</w:t>
       </w:r>
       <w:r>
-        <w:rPr/>
-        <w:t>V</w:t>
-      </w:r>
-      <w:bookmarkStart w:name="_GoBack" w:id="0"/>
-      <w:bookmarkEnd w:id="0"/>
-      <w:r>
-        <w:rPr/>
+        <w:t>X</w:t>
+      </w:r>
+      <w:r>
         <w:t>/202</w:t>
       </w:r>
       <w:r>
-        <w:rPr/>
         <w:t>6</w:t>
       </w:r>
     </w:p>
@@ -355,7 +252,6 @@
         <w:ind w:left="851"/>
       </w:pPr>
       <w:r>
-        <w:rPr/>
         <w:t>Kepada</w:t>
       </w:r>
       <w:r>
@@ -365,11 +261,9 @@
         <w:t xml:space="preserve"> Y</w:t>
       </w:r>
       <w:r>
-        <w:rPr/>
         <w:t>t</w:t>
       </w:r>
       <w:r>
-        <w:rPr/>
         <w:t>h.</w:t>
       </w:r>
     </w:p>
@@ -378,42 +272,35 @@
         <w:pStyle w:val="BodyText"/>
         <w:ind w:left="851"/>
         <w:rPr>
-          <w:b w:val="1"/>
-          <w:bCs w:val="1"/>
-        </w:rPr>
-      </w:pPr>
-      <w:r>
-        <w:rPr>
-          <w:b w:val="1"/>
-          <w:bCs w:val="1"/>
+          <w:b/>
+          <w:bCs/>
+        </w:rPr>
+      </w:pPr>
+      <w:r>
+        <w:rPr>
+          <w:b/>
+          <w:bCs/>
         </w:rPr>
         <w:t xml:space="preserve">Orangtua/Wali </w:t>
       </w:r>
       <w:r>
         <w:rPr>
-          <w:b w:val="1"/>
-          <w:bCs w:val="1"/>
-        </w:rPr>
-        <w:t>Ananda</w:t>
-      </w:r>
-      <w:r>
-        <w:rPr>
-          <w:b w:val="1"/>
-          <w:bCs w:val="1"/>
-        </w:rPr>
-        <w:t xml:space="preserve"> </w:t>
-      </w:r>
-      <w:r>
-        <w:rPr>
-          <w:b w:val="1"/>
-          <w:bCs w:val="1"/>
+          <w:b/>
+          <w:bCs/>
+        </w:rPr>
+        <w:t xml:space="preserve">Ananda </w:t>
+      </w:r>
+      <w:r>
+        <w:rPr>
+          <w:b/>
+          <w:bCs/>
         </w:rPr>
         <w:t>Calon Santri</w:t>
       </w:r>
       <w:r>
         <w:rPr>
-          <w:b w:val="1"/>
-          <w:bCs w:val="1"/>
+          <w:b/>
+          <w:bCs/>
         </w:rPr>
         <w:t xml:space="preserve"> </w:t>
       </w:r>
@@ -524,70 +411,70 @@
       <w:r>
         <w:rPr>
           <w:spacing w:val="40"/>
-          <w:rtl w:val="1"/>
+          <w:rtl/>
         </w:rPr>
         <w:t xml:space="preserve"> </w:t>
       </w:r>
       <w:r>
         <w:rPr>
           <w:w w:val="73"/>
-          <w:rtl w:val="1"/>
+          <w:rtl/>
         </w:rPr>
         <w:t>السلام</w:t>
       </w:r>
       <w:r>
         <w:rPr>
           <w:spacing w:val="6"/>
-          <w:rtl w:val="1"/>
+          <w:rtl/>
         </w:rPr>
         <w:t xml:space="preserve"> </w:t>
       </w:r>
       <w:r>
         <w:rPr>
           <w:w w:val="73"/>
-          <w:rtl w:val="1"/>
+          <w:rtl/>
         </w:rPr>
         <w:t>عليكم</w:t>
       </w:r>
       <w:r>
         <w:rPr>
           <w:spacing w:val="3"/>
-          <w:rtl w:val="1"/>
+          <w:rtl/>
         </w:rPr>
         <w:t xml:space="preserve"> </w:t>
       </w:r>
       <w:r>
         <w:rPr>
           <w:w w:val="73"/>
-          <w:rtl w:val="1"/>
+          <w:rtl/>
         </w:rPr>
         <w:t>ورحمة</w:t>
       </w:r>
       <w:r>
         <w:rPr>
           <w:spacing w:val="3"/>
-          <w:rtl w:val="1"/>
+          <w:rtl/>
         </w:rPr>
         <w:t xml:space="preserve"> </w:t>
       </w:r>
       <w:r>
         <w:rPr>
           <w:w w:val="73"/>
-          <w:rtl w:val="1"/>
+          <w:rtl/>
         </w:rPr>
         <w:t>الله</w:t>
       </w:r>
       <w:r>
         <w:rPr>
           <w:spacing w:val="3"/>
-          <w:rtl w:val="1"/>
+          <w:rtl/>
         </w:rPr>
         <w:t xml:space="preserve"> </w:t>
       </w:r>
       <w:r>
         <w:rPr>
           <w:w w:val="73"/>
-          <w:rtl w:val="1"/>
+          <w:rtl/>
         </w:rPr>
         <w:t>وبركاته</w:t>
       </w:r>
@@ -610,7 +497,6 @@
         <w:jc w:val="both"/>
       </w:pPr>
       <w:r>
-        <w:rPr/>
         <w:t>Alhamdulillah</w:t>
       </w:r>
       <w:r>
@@ -620,7 +506,6 @@
         <w:t xml:space="preserve"> </w:t>
       </w:r>
       <w:r>
-        <w:rPr/>
         <w:t>segala</w:t>
       </w:r>
       <w:r>
@@ -630,7 +515,6 @@
         <w:t xml:space="preserve"> </w:t>
       </w:r>
       <w:r>
-        <w:rPr/>
         <w:t>puji</w:t>
       </w:r>
       <w:r>
@@ -640,7 +524,6 @@
         <w:t xml:space="preserve"> </w:t>
       </w:r>
       <w:r>
-        <w:rPr/>
         <w:t>bagi</w:t>
       </w:r>
       <w:r>
@@ -650,7 +533,6 @@
         <w:t xml:space="preserve"> </w:t>
       </w:r>
       <w:r>
-        <w:rPr/>
         <w:t>Allah</w:t>
       </w:r>
       <w:r>
@@ -660,7 +542,6 @@
         <w:t xml:space="preserve"> </w:t>
       </w:r>
       <w:r>
-        <w:rPr/>
         <w:t>Rabb</w:t>
       </w:r>
       <w:r>
@@ -670,7 +551,6 @@
         <w:t xml:space="preserve"> </w:t>
       </w:r>
       <w:r>
-        <w:rPr/>
         <w:t>semesta</w:t>
       </w:r>
       <w:r>
@@ -680,7 +560,6 @@
         <w:t xml:space="preserve"> </w:t>
       </w:r>
       <w:r>
-        <w:rPr/>
         <w:t>alam.</w:t>
       </w:r>
       <w:r>
@@ -690,7 +569,6 @@
         <w:t xml:space="preserve"> </w:t>
       </w:r>
       <w:r>
-        <w:rPr/>
         <w:t>Shalawat</w:t>
       </w:r>
       <w:r>
@@ -700,7 +578,6 @@
         <w:t xml:space="preserve"> </w:t>
       </w:r>
       <w:r>
-        <w:rPr/>
         <w:t>dan</w:t>
       </w:r>
       <w:r>
@@ -710,7 +587,6 @@
         <w:t xml:space="preserve"> </w:t>
       </w:r>
       <w:r>
-        <w:rPr/>
         <w:t>salam</w:t>
       </w:r>
       <w:r>
@@ -720,7 +596,6 @@
         <w:t xml:space="preserve"> </w:t>
       </w:r>
       <w:r>
-        <w:rPr/>
         <w:t>semoga</w:t>
       </w:r>
       <w:r>
@@ -730,7 +605,6 @@
         <w:t xml:space="preserve"> </w:t>
       </w:r>
       <w:r>
-        <w:rPr/>
         <w:t>tercurah</w:t>
       </w:r>
       <w:r>
@@ -740,21 +614,18 @@
         <w:t xml:space="preserve"> </w:t>
       </w:r>
       <w:r>
-        <w:rPr/>
         <w:t xml:space="preserve">kepada Rasulullah </w:t>
       </w:r>
       <w:r>
         <w:rPr>
-          <w:rtl w:val="1"/>
+          <w:rtl/>
         </w:rPr>
         <w:t>ﷺ</w:t>
       </w:r>
       <w:r>
-        <w:rPr/>
-        <w:t xml:space="preserve"> </w:t>
-      </w:r>
-      <w:r>
-        <w:rPr/>
+        <w:t xml:space="preserve"> </w:t>
+      </w:r>
+      <w:r>
         <w:t>keluarga, para sahabat, dan pengikutnya hingga akhir zaman.</w:t>
       </w:r>
     </w:p>
@@ -811,7 +682,6 @@
         <w:jc w:val="both"/>
       </w:pPr>
       <w:r>
-        <w:rPr/>
         <w:t>Selanjutnya,</w:t>
       </w:r>
       <w:r>
@@ -821,7 +691,6 @@
         <w:t xml:space="preserve"> </w:t>
       </w:r>
       <w:r>
-        <w:rPr/>
         <w:t>Kami</w:t>
       </w:r>
       <w:r>
@@ -831,7 +700,6 @@
         <w:t xml:space="preserve"> </w:t>
       </w:r>
       <w:r>
-        <w:rPr/>
         <w:t>selaku</w:t>
       </w:r>
       <w:r>
@@ -841,7 +709,6 @@
         <w:t xml:space="preserve"> </w:t>
       </w:r>
       <w:r>
-        <w:rPr/>
         <w:t>Panitia</w:t>
       </w:r>
       <w:r>
@@ -851,7 +718,6 @@
         <w:t xml:space="preserve"> </w:t>
       </w:r>
       <w:r>
-        <w:rPr/>
         <w:t>Penerimaan</w:t>
       </w:r>
       <w:r>
@@ -861,7 +727,6 @@
         <w:t xml:space="preserve"> </w:t>
       </w:r>
       <w:r>
-        <w:rPr/>
         <w:t>Santri</w:t>
       </w:r>
       <w:r>
@@ -871,7 +736,6 @@
         <w:t xml:space="preserve"> </w:t>
       </w:r>
       <w:r>
-        <w:rPr/>
         <w:t>Baru</w:t>
       </w:r>
       <w:r>
@@ -881,7 +745,6 @@
         <w:t xml:space="preserve"> </w:t>
       </w:r>
       <w:r>
-        <w:rPr/>
         <w:t>Pesantren Ulul Albaab Sukabumi</w:t>
       </w:r>
       <w:r>
@@ -891,19 +754,15 @@
         <w:t xml:space="preserve"> </w:t>
       </w:r>
       <w:r>
-        <w:rPr/>
         <w:t>T</w:t>
       </w:r>
       <w:r>
-        <w:rPr/>
         <w:t xml:space="preserve">ahun </w:t>
       </w:r>
       <w:r>
-        <w:rPr/>
         <w:t>P</w:t>
       </w:r>
       <w:r>
-        <w:rPr/>
         <w:t>elajaran</w:t>
       </w:r>
       <w:r>
@@ -913,39 +772,30 @@
         <w:t xml:space="preserve"> </w:t>
       </w:r>
       <w:r>
-        <w:rPr/>
         <w:t>202</w:t>
       </w:r>
       <w:r>
-        <w:rPr/>
-        <w:t>6</w:t>
-      </w:r>
-      <w:r>
-        <w:rPr/>
+        <w:t>7</w:t>
+      </w:r>
+      <w:r>
         <w:t>/202</w:t>
       </w:r>
       <w:r>
-        <w:rPr/>
-        <w:t>7</w:t>
-      </w:r>
-      <w:r>
-        <w:rPr/>
+        <w:t>8</w:t>
+      </w:r>
+      <w:r>
         <w:t xml:space="preserve"> mengucapkan selamat kepada putra</w:t>
       </w:r>
       <w:r>
-        <w:rPr/>
         <w:t>/putri</w:t>
       </w:r>
       <w:r>
-        <w:rPr/>
         <w:t xml:space="preserve"> Bapak/Ibu</w:t>
       </w:r>
       <w:r>
-        <w:rPr/>
         <w:t xml:space="preserve"> yang bernama</w:t>
       </w:r>
       <w:r>
-        <w:rPr/>
         <w:t>:</w:t>
       </w:r>
     </w:p>
@@ -960,8 +810,8 @@
       </w:pPr>
       <w:r>
         <w:rPr>
-          <w:b w:val="1"/>
-          <w:bCs w:val="1"/>
+          <w:b/>
+          <w:bCs/>
           <w:spacing w:val="-2"/>
           <w:sz w:val="24"/>
           <w:szCs w:val="24"/>
@@ -978,8 +828,8 @@
       </w:r>
       <w:r>
         <w:rPr>
-          <w:b w:val="1"/>
-          <w:bCs w:val="1"/>
+          <w:b/>
+          <w:bCs/>
           <w:sz w:val="24"/>
           <w:szCs w:val="24"/>
         </w:rPr>
@@ -987,80 +837,22 @@
       </w:r>
       <w:r>
         <w:rPr>
-          <w:b w:val="1"/>
-          <w:bCs w:val="1"/>
+          <w:b/>
+          <w:bCs/>
           <w:sz w:val="24"/>
           <w:szCs w:val="24"/>
         </w:rPr>
-        <w:t>:</w:t>
-      </w:r>
-      <w:r>
-        <w:rPr>
-          <w:b w:val="1"/>
-          <w:bCs w:val="1"/>
-          <w:sz w:val="24"/>
-          <w:szCs w:val="24"/>
-        </w:rPr>
-        <w:t xml:space="preserve"> </w:t>
-      </w:r>
-      <w:r>
-        <w:rPr>
-          <w:b w:val="1"/>
-          <w:bCs w:val="1"/>
+        <w:t xml:space="preserve">: </w:t>
+      </w:r>
+      <w:r>
+        <w:rPr>
+          <w:b/>
+          <w:bCs/>
           <w:spacing w:val="-1"/>
           <w:sz w:val="24"/>
           <w:szCs w:val="24"/>
         </w:rPr>
-        <w:fldChar w:fldCharType="begin"/>
-      </w:r>
-      <w:r>
-        <w:rPr>
-          <w:b w:val="1"/>
-          <w:bCs w:val="1"/>
-          <w:spacing w:val="-1"/>
-          <w:sz w:val="24"/>
-          <w:szCs w:val="24"/>
-        </w:rPr>
-        <w:instrText xml:space="preserve"> MERGEFIELD Upper_Nama </w:instrText>
-      </w:r>
-      <w:r>
-        <w:rPr>
-          <w:b w:val="1"/>
-          <w:bCs w:val="1"/>
-          <w:spacing w:val="-1"/>
-          <w:sz w:val="24"/>
-          <w:szCs w:val="24"/>
-        </w:rPr>
-        <w:fldChar w:fldCharType="separate"/>
-      </w:r>
-      <w:r>
-        <w:rPr>
-          <w:b w:val="1"/>
-          <w:bCs w:val="1"/>
-          <w:noProof/>
-          <w:sz w:val="24"/>
-          <w:szCs w:val="24"/>
-        </w:rPr>
-        <w:t>I</w:t>
-      </w:r>
-      <w:r>
-        <w:rPr>
-          <w:b w:val="1"/>
-          <w:bCs w:val="1"/>
-          <w:spacing w:val="-1"/>
-          <w:sz w:val="24"/>
-          <w:szCs w:val="24"/>
-        </w:rPr>
-        <w:fldChar w:fldCharType="end"/>
-      </w:r>
-      <w:r>
-        <w:rPr>
-          <w:b w:val="1"/>
-          <w:bCs w:val="1"/>
-          <w:sz w:val="24"/>
-          <w:szCs w:val="24"/>
-        </w:rPr>
-        <w:t>KLIMAH MARDHATILLAH</w:t>
+        <w:t>JOOARA JUANG</w:t>
       </w:r>
     </w:p>
     <w:p>
@@ -1072,8 +864,8 @@
         <w:ind w:left="851" w:firstLine="565"/>
         <w:jc w:val="both"/>
         <w:rPr>
-          <w:b w:val="1"/>
-          <w:bCs w:val="1"/>
+          <w:b/>
+          <w:bCs/>
           <w:noProof/>
           <w:sz w:val="24"/>
           <w:szCs w:val="24"/>
@@ -1081,8 +873,8 @@
       </w:pPr>
       <w:r>
         <w:rPr>
-          <w:b w:val="1"/>
-          <w:bCs w:val="1"/>
+          <w:b/>
+          <w:bCs/>
           <w:sz w:val="24"/>
           <w:szCs w:val="24"/>
         </w:rPr>
@@ -1090,8 +882,8 @@
       </w:r>
       <w:r>
         <w:rPr>
-          <w:b w:val="1"/>
-          <w:bCs w:val="1"/>
+          <w:b/>
+          <w:bCs/>
           <w:spacing w:val="-2"/>
           <w:sz w:val="24"/>
           <w:szCs w:val="24"/>
@@ -1108,8 +900,8 @@
       </w:r>
       <w:r>
         <w:rPr>
-          <w:b w:val="1"/>
-          <w:bCs w:val="1"/>
+          <w:b/>
+          <w:bCs/>
           <w:sz w:val="24"/>
           <w:szCs w:val="24"/>
         </w:rPr>
@@ -1117,8 +909,8 @@
       </w:r>
       <w:r>
         <w:rPr>
-          <w:b w:val="1"/>
-          <w:bCs w:val="1"/>
+          <w:b/>
+          <w:bCs/>
           <w:sz w:val="24"/>
           <w:szCs w:val="24"/>
         </w:rPr>
@@ -1126,12 +918,57 @@
       </w:r>
       <w:r>
         <w:rPr>
-          <w:b w:val="1"/>
-          <w:bCs w:val="1"/>
+          <w:b/>
+          <w:bCs/>
           <w:sz w:val="24"/>
           <w:szCs w:val="24"/>
         </w:rPr>
-        <w:t>MTI260001</w:t>
+        <w:t>MT</w:t>
+      </w:r>
+      <w:r>
+        <w:rPr>
+          <w:b/>
+          <w:bCs/>
+          <w:sz w:val="24"/>
+          <w:szCs w:val="24"/>
+        </w:rPr>
+        <w:t>A</w:t>
+      </w:r>
+      <w:r>
+        <w:rPr>
+          <w:b/>
+          <w:bCs/>
+          <w:sz w:val="24"/>
+          <w:szCs w:val="24"/>
+        </w:rPr>
+        <w:t>2</w:t>
+      </w:r>
+      <w:r>
+        <w:rPr>
+          <w:b/>
+          <w:bCs/>
+          <w:sz w:val="24"/>
+          <w:szCs w:val="24"/>
+        </w:rPr>
+        <w:t>7</w:t>
+      </w:r>
+      <w:r>
+        <w:rPr>
+          <w:b/>
+          <w:bCs/>
+          <w:sz w:val="24"/>
+          <w:szCs w:val="24"/>
+        </w:rPr>
+        <w:t>0001</w:t>
+      </w:r>
+      <w:r>
+        <w:rPr>
+          <w:b/>
+          <w:bCs/>
+          <w:sz w:val="24"/>
+          <w:szCs w:val="24"/>
+        </w:rPr>
+        <w:t>6</w:t>
       </w:r>
     </w:p>
     <w:p>
@@ -1195,7 +1032,16 @@
         <w:t xml:space="preserve"> </w:t>
       </w:r>
       <w:r>
-        <w:t>2026/2027</w:t>
+        <w:t>202</w:t>
+      </w:r>
+      <w:r>
+        <w:t>7</w:t>
+      </w:r>
+      <w:r>
+        <w:t>/202</w:t>
+      </w:r>
+      <w:r>
+        <w:t>8</w:t>
       </w:r>
       <w:r>
         <w:rPr>
@@ -1291,7 +1137,7 @@
           <w:noProof/>
           <w:spacing w:val="-2"/>
         </w:rPr>
-        <w:t>MTs Putri</w:t>
+        <w:t>MTs Putr</w:t>
       </w:r>
       <w:r>
         <w:rPr>
@@ -1300,6 +1146,14 @@
           <w:spacing w:val="-2"/>
         </w:rPr>
         <w:fldChar w:fldCharType="end"/>
+      </w:r>
+      <w:r>
+        <w:rPr>
+          <w:b/>
+          <w:bCs/>
+          <w:spacing w:val="-2"/>
+        </w:rPr>
+        <w:t>a</w:t>
       </w:r>
     </w:p>
     <w:p>
@@ -1588,13 +1442,13 @@
           <w:noProof/>
         </w:rPr>
         <w:drawing>
-          <wp:anchor distT="0" distB="0" distL="114300" distR="114300" simplePos="0" relativeHeight="251660800" behindDoc="0" locked="0" layoutInCell="1" allowOverlap="1" wp14:anchorId="32845374" wp14:editId="65C190D7">
+          <wp:anchor distT="0" distB="0" distL="114300" distR="114300" simplePos="0" relativeHeight="251660800" behindDoc="0" locked="0" layoutInCell="1" allowOverlap="1" wp14:anchorId="32845374" wp14:editId="0A51B56D">
             <wp:simplePos x="0" y="0"/>
             <wp:positionH relativeFrom="column">
               <wp:posOffset>1434465</wp:posOffset>
             </wp:positionH>
             <wp:positionV relativeFrom="paragraph">
-              <wp:posOffset>114935</wp:posOffset>
+              <wp:posOffset>140335</wp:posOffset>
             </wp:positionV>
             <wp:extent cx="2199005" cy="1195705"/>
             <wp:effectExtent l="0" t="0" r="0" b="4445"/>
@@ -1635,12 +1489,12 @@
         <w:tblStyle w:val="TableGrid"/>
         <w:tblW w:w="9231" w:type="dxa"/>
         <w:tblBorders>
-          <w:top w:val="none" w:color="auto" w:sz="0" w:space="0"/>
-          <w:left w:val="none" w:color="auto" w:sz="0" w:space="0"/>
-          <w:bottom w:val="none" w:color="auto" w:sz="0" w:space="0"/>
-          <w:right w:val="none" w:color="auto" w:sz="0" w:space="0"/>
-          <w:insideH w:val="none" w:color="auto" w:sz="0" w:space="0"/>
-          <w:insideV w:val="none" w:color="auto" w:sz="0" w:space="0"/>
+          <w:top w:val="none" w:sz="0" w:space="0" w:color="auto"/>
+          <w:left w:val="none" w:sz="0" w:space="0" w:color="auto"/>
+          <w:bottom w:val="none" w:sz="0" w:space="0" w:color="auto"/>
+          <w:right w:val="none" w:sz="0" w:space="0" w:color="auto"/>
+          <w:insideH w:val="none" w:sz="0" w:space="0" w:color="auto"/>
+          <w:insideV w:val="none" w:sz="0" w:space="0" w:color="auto"/>
         </w:tblBorders>
         <w:tblLook w:val="04A0" w:firstRow="1" w:lastRow="0" w:firstColumn="1" w:lastColumn="0" w:noHBand="0" w:noVBand="1"/>
       </w:tblPr>
@@ -1671,6 +1525,9 @@
               <w:ind w:left="0" w:right="130"/>
             </w:pPr>
             <w:r>
+              <w:t xml:space="preserve">  </w:t>
+            </w:r>
+            <w:r>
               <w:t xml:space="preserve">Sukabumi, </w:t>
             </w:r>
             <w:r>
@@ -1686,13 +1543,25 @@
               <w:rPr>
                 <w:noProof/>
               </w:rPr>
-              <w:t xml:space="preserve">09 Mei </w:t>
+              <w:t xml:space="preserve">09 </w:t>
             </w:r>
             <w:r>
               <w:rPr>
                 <w:noProof/>
               </w:rPr>
-              <w:t xml:space="preserve"> 2026</w:t>
+              <w:t>Oktober</w:t>
+            </w:r>
+            <w:r>
+              <w:rPr>
+                <w:noProof/>
+              </w:rPr>
+              <w:t xml:space="preserve"> </w:t>
+            </w:r>
+            <w:r>
+              <w:rPr>
+                <w:noProof/>
+              </w:rPr>
+              <w:t>2026</w:t>
             </w:r>
             <w:r>
               <w:fldChar w:fldCharType="end"/>
@@ -1703,6 +1572,9 @@
               <w:pStyle w:val="BodyText"/>
               <w:ind w:left="0" w:right="130"/>
             </w:pPr>
+            <w:r>
+              <w:t xml:space="preserve">  </w:t>
+            </w:r>
             <w:r>
               <w:t>Ketua</w:t>
             </w:r>
@@ -1740,21 +1612,22 @@
             </w:pPr>
             <w:r>
               <w:rPr>
+                <w:b/>
                 <w:noProof/>
               </w:rPr>
               <w:drawing>
-                <wp:anchor distT="0" distB="0" distL="114300" distR="114300" simplePos="0" relativeHeight="487557632" behindDoc="0" locked="0" layoutInCell="1" allowOverlap="1" wp14:anchorId="36D78DB1" wp14:editId="74A717EA">
+                <wp:anchor distT="0" distB="0" distL="114300" distR="114300" simplePos="0" relativeHeight="487559680" behindDoc="0" locked="0" layoutInCell="1" allowOverlap="1" wp14:anchorId="64CC70DC" wp14:editId="6B2FC343">
                   <wp:simplePos x="0" y="0"/>
                   <wp:positionH relativeFrom="column">
-                    <wp:posOffset>0</wp:posOffset>
+                    <wp:posOffset>-381635</wp:posOffset>
                   </wp:positionH>
                   <wp:positionV relativeFrom="paragraph">
-                    <wp:posOffset>-78622</wp:posOffset>
+                    <wp:posOffset>-716915</wp:posOffset>
                   </wp:positionV>
-                  <wp:extent cx="2232660" cy="793470"/>
-                  <wp:effectExtent l="0" t="0" r="0" b="6985"/>
+                  <wp:extent cx="2413635" cy="2162175"/>
+                  <wp:effectExtent l="0" t="0" r="0" b="0"/>
                   <wp:wrapNone/>
-                  <wp:docPr id="5" name="Picture 5"/>
+                  <wp:docPr id="1" name="Picture 1"/>
                   <wp:cNvGraphicFramePr>
                     <a:graphicFrameLocks xmlns:a="http://schemas.openxmlformats.org/drawingml/2006/main" noChangeAspect="1"/>
                   </wp:cNvGraphicFramePr>
@@ -1762,41 +1635,52 @@
                     <a:graphicData uri="http://schemas.openxmlformats.org/drawingml/2006/picture">
                       <pic:pic xmlns:pic="http://schemas.openxmlformats.org/drawingml/2006/picture">
                         <pic:nvPicPr>
-                          <pic:cNvPr id="0" name="Picture 2"/>
-                          <pic:cNvPicPr>
-                            <a:picLocks noChangeAspect="1" noChangeArrowheads="1"/>
-                          </pic:cNvPicPr>
+                          <pic:cNvPr id="1" name="Picture 1"/>
+                          <pic:cNvPicPr/>
                         </pic:nvPicPr>
                         <pic:blipFill>
                           <a:blip r:embed="rId7">
+                            <a:biLevel thresh="50000"/>
                             <a:extLst>
+                              <a:ext uri="{BEBA8EAE-BF5A-486C-A8C5-ECC9F3942E4B}">
+                                <a14:imgProps xmlns:a14="http://schemas.microsoft.com/office/drawing/2010/main">
+                                  <a14:imgLayer r:embed="rId8">
+                                    <a14:imgEffect>
+                                      <a14:sharpenSoften amount="51000"/>
+                                    </a14:imgEffect>
+                                    <a14:imgEffect>
+                                      <a14:brightnessContrast bright="-31000" contrast="50000"/>
+                                    </a14:imgEffect>
+                                  </a14:imgLayer>
+                                </a14:imgProps>
+                              </a:ext>
                               <a:ext uri="{28A0092B-C50C-407E-A947-70E740481C1C}">
                                 <a14:useLocalDpi xmlns:a14="http://schemas.microsoft.com/office/drawing/2010/main" val="0"/>
                               </a:ext>
                             </a:extLst>
                           </a:blip>
-                          <a:srcRect/>
                           <a:stretch>
                             <a:fillRect/>
                           </a:stretch>
                         </pic:blipFill>
-                        <pic:spPr bwMode="auto">
+                        <pic:spPr>
                           <a:xfrm>
                             <a:off x="0" y="0"/>
-                            <a:ext cx="2232660" cy="793470"/>
+                            <a:ext cx="2413635" cy="2162175"/>
                           </a:xfrm>
                           <a:prstGeom prst="rect">
                             <a:avLst/>
                           </a:prstGeom>
-                          <a:noFill/>
+                          <a:effectLst>
+                            <a:glow rad="12700">
+                              <a:schemeClr val="tx1"/>
+                            </a:glow>
+                          </a:effectLst>
                         </pic:spPr>
                       </pic:pic>
                     </a:graphicData>
                   </a:graphic>
-                  <wp14:sizeRelH relativeFrom="page">
-                    <wp14:pctWidth>0</wp14:pctWidth>
-                  </wp14:sizeRelH>
-                  <wp14:sizeRelV relativeFrom="page">
+                  <wp14:sizeRelV relativeFrom="margin">
                     <wp14:pctHeight>0</wp14:pctHeight>
                   </wp14:sizeRelV>
                 </wp:anchor>
@@ -1849,7 +1733,13 @@
               <w:rPr>
                 <w:b/>
               </w:rPr>
-              <w:t>Ujang Marfudin, S.IP., M.Si</w:t>
+              <w:t xml:space="preserve">  </w:t>
+            </w:r>
+            <w:r>
+              <w:rPr>
+                <w:b/>
+              </w:rPr>
+              <w:t>Tri Sunyoto, M.Pd.</w:t>
             </w:r>
           </w:p>
         </w:tc>
@@ -2025,7 +1915,7 @@
         <w:t>.</w:t>
       </w:r>
       <w:r>
-        <w:t>8</w:t>
+        <w:t>9</w:t>
       </w:r>
       <w:r>
         <w:t>00.000,-</w:t>
@@ -2062,7 +1952,7 @@
         <w:rPr>
           <w:i/>
         </w:rPr>
-        <w:t>delapan</w:t>
+        <w:t>sembilan</w:t>
       </w:r>
       <w:r>
         <w:rPr>
@@ -2350,7 +2240,7 @@
         <w:t xml:space="preserve"> </w:t>
       </w:r>
       <w:r>
-        <w:t xml:space="preserve">Juli </w:t>
+        <w:t xml:space="preserve">Mei </w:t>
       </w:r>
       <w:r>
         <w:rPr>
@@ -2362,7 +2252,7 @@
         <w:rPr>
           <w:spacing w:val="-2"/>
         </w:rPr>
-        <w:t>6</w:t>
+        <w:t>7</w:t>
       </w:r>
       <w:r>
         <w:rPr>
@@ -2534,7 +2424,7 @@
     </w:p>
     <w:sectPr>
       <w:type w:val="continuous"/>
-      <w:pgSz w:w="12242" w:h="18711" w:orient="portrait" w:code="10000"/>
+      <w:pgSz w:w="12242" w:h="18711" w:code="10000"/>
       <w:pgMar w:top="1922" w:right="1701" w:bottom="278" w:left="1701" w:header="720" w:footer="720" w:gutter="0"/>
       <w:cols w:space="720"/>
     </w:sectPr>
@@ -2543,7 +2433,7 @@
 </file>
 
 <file path=word/numbering.xml><?xml version="1.0" encoding="utf-8"?>
-<w:numbering xmlns:wpc="http://schemas.microsoft.com/office/word/2010/wordprocessingCanvas" xmlns:cx="http://schemas.microsoft.com/office/drawing/2014/chartex" xmlns:cx1="http://schemas.microsoft.com/office/drawing/2015/9/8/chartex" xmlns:cx2="http://schemas.microsoft.com/office/drawing/2015/10/21/chartex" xmlns:cx3="http://schemas.microsoft.com/office/drawing/2016/5/9/chartex" xmlns:cx4="http://schemas.microsoft.com/office/drawing/2016/5/10/chartex" xmlns:cx5="http://schemas.microsoft.com/office/drawing/2016/5/11/chartex" xmlns:cx6="http://schemas.microsoft.com/office/drawing/2016/5/12/chartex" xmlns:cx7="http://schemas.microsoft.com/office/drawing/2016/5/13/chartex" xmlns:cx8="http://schemas.microsoft.com/office/drawing/2016/5/14/chartex" xmlns:mc="http://schemas.openxmlformats.org/markup-compatibility/2006" xmlns:aink="http://schemas.microsoft.com/office/drawing/2016/ink" xmlns:am3d="http://schemas.microsoft.com/office/drawing/2017/model3d" xmlns:o="urn:schemas-microsoft-com:office:office" xmlns:r="http://schemas.openxmlformats.org/officeDocument/2006/relationships" xmlns:m="http://schemas.openxmlformats.org/officeDocument/2006/math" xmlns:v="urn:schemas-microsoft-com:vml" xmlns:wp14="http://schemas.microsoft.com/office/word/2010/wordprocessingDrawing" xmlns:wp="http://schemas.openxmlformats.org/drawingml/2006/wordprocessingDrawing" xmlns:w10="urn:schemas-microsoft-com:office:word" xmlns:w="http://schemas.openxmlformats.org/wordprocessingml/2006/main" xmlns:w14="http://schemas.microsoft.com/office/word/2010/wordml" xmlns:w15="http://schemas.microsoft.com/office/word/2012/wordml" xmlns:w16cex="http://schemas.microsoft.com/office/word/2018/wordml/cex" xmlns:w16cid="http://schemas.microsoft.com/office/word/2016/wordml/cid" xmlns:w16="http://schemas.microsoft.com/office/word/2018/wordml" xmlns:w16se="http://schemas.microsoft.com/office/word/2015/wordml/symex" xmlns:wpg="http://schemas.microsoft.com/office/word/2010/wordprocessingGroup" xmlns:wpi="http://schemas.microsoft.com/office/word/2010/wordprocessingInk" xmlns:wne="http://schemas.microsoft.com/office/word/2006/wordml" xmlns:wps="http://schemas.microsoft.com/office/word/2010/wordprocessingShape" mc:Ignorable="w14 w15 w16se w16cid w16 w16cex wp14">
+<w:numbering xmlns:wpc="http://schemas.microsoft.com/office/word/2010/wordprocessingCanvas" xmlns:cx="http://schemas.microsoft.com/office/drawing/2014/chartex" xmlns:cx1="http://schemas.microsoft.com/office/drawing/2015/9/8/chartex" xmlns:cx2="http://schemas.microsoft.com/office/drawing/2015/10/21/chartex" xmlns:cx3="http://schemas.microsoft.com/office/drawing/2016/5/9/chartex" xmlns:cx4="http://schemas.microsoft.com/office/drawing/2016/5/10/chartex" xmlns:cx5="http://schemas.microsoft.com/office/drawing/2016/5/11/chartex" xmlns:cx6="http://schemas.microsoft.com/office/drawing/2016/5/12/chartex" xmlns:cx7="http://schemas.microsoft.com/office/drawing/2016/5/13/chartex" xmlns:cx8="http://schemas.microsoft.com/office/drawing/2016/5/14/chartex" xmlns:mc="http://schemas.openxmlformats.org/markup-compatibility/2006" xmlns:aink="http://schemas.microsoft.com/office/drawing/2016/ink" xmlns:am3d="http://schemas.microsoft.com/office/drawing/2017/model3d" xmlns:o="urn:schemas-microsoft-com:office:office" xmlns:oel="http://schemas.microsoft.com/office/2019/extlst" xmlns:r="http://schemas.openxmlformats.org/officeDocument/2006/relationships" xmlns:m="http://schemas.openxmlformats.org/officeDocument/2006/math" xmlns:v="urn:schemas-microsoft-com:vml" xmlns:wp14="http://schemas.microsoft.com/office/word/2010/wordprocessingDrawing" xmlns:wp="http://schemas.openxmlformats.org/drawingml/2006/wordprocessingDrawing" xmlns:w10="urn:schemas-microsoft-com:office:word" xmlns:w="http://schemas.openxmlformats.org/wordprocessingml/2006/main" xmlns:w14="http://schemas.microsoft.com/office/word/2010/wordml" xmlns:w15="http://schemas.microsoft.com/office/word/2012/wordml" xmlns:w16cex="http://schemas.microsoft.com/office/word/2018/wordml/cex" xmlns:w16cid="http://schemas.microsoft.com/office/word/2016/wordml/cid" xmlns:w16="http://schemas.microsoft.com/office/word/2018/wordml" xmlns:w16sdtdh="http://schemas.microsoft.com/office/word/2020/wordml/sdtdatahash" xmlns:w16se="http://schemas.microsoft.com/office/word/2015/wordml/symex" xmlns:wpg="http://schemas.microsoft.com/office/word/2010/wordprocessingGroup" xmlns:wpi="http://schemas.microsoft.com/office/word/2010/wordprocessingInk" xmlns:wne="http://schemas.microsoft.com/office/word/2006/wordml" xmlns:wps="http://schemas.microsoft.com/office/word/2010/wordprocessingShape" mc:Ignorable="w14 w15 w16se w16cid w16 w16cex w16sdtdh wp14">
   <w:abstractNum w:abstractNumId="0" w15:restartNumberingAfterBreak="0">
     <w:nsid w:val="18C747CC"/>
     <w:multiLevelType w:val="hybridMultilevel"/>
@@ -2558,7 +2448,7 @@
         <w:jc w:val="left"/>
       </w:pPr>
       <w:rPr>
-        <w:rFonts w:hint="default" w:ascii="Times New Roman" w:hAnsi="Times New Roman" w:eastAsia="Times New Roman" w:cs="Times New Roman"/>
+        <w:rFonts w:ascii="Times New Roman" w:eastAsia="Times New Roman" w:hAnsi="Times New Roman" w:cs="Times New Roman" w:hint="default"/>
         <w:b w:val="0"/>
         <w:bCs w:val="0"/>
         <w:i w:val="0"/>
@@ -2667,18 +2557,18 @@
       </w:rPr>
     </w:lvl>
   </w:abstractNum>
-  <w:num w:numId="1">
+  <w:num w:numId="1" w16cid:durableId="1772584756">
     <w:abstractNumId w:val="0"/>
   </w:num>
 </w:numbering>
 </file>
 
 <file path=word/styles.xml><?xml version="1.0" encoding="utf-8"?>
-<w:styles xmlns:wp14="http://schemas.microsoft.com/office/word/2010/wordprocessingDrawing" xmlns:mc="http://schemas.openxmlformats.org/markup-compatibility/2006" xmlns:r="http://schemas.openxmlformats.org/officeDocument/2006/relationships" xmlns:w="http://schemas.openxmlformats.org/wordprocessingml/2006/main" xmlns:w14="http://schemas.microsoft.com/office/word/2010/wordml" xmlns:w15="http://schemas.microsoft.com/office/word/2012/wordml" xmlns:w16cex="http://schemas.microsoft.com/office/word/2018/wordml/cex" xmlns:w16cid="http://schemas.microsoft.com/office/word/2016/wordml/cid" xmlns:w16="http://schemas.microsoft.com/office/word/2018/wordml" xmlns:w16se="http://schemas.microsoft.com/office/word/2015/wordml/symex" mc:Ignorable="w14 w15 w16se w16cid w16 w16cex wp14">
+<w:styles xmlns:mc="http://schemas.openxmlformats.org/markup-compatibility/2006" xmlns:r="http://schemas.openxmlformats.org/officeDocument/2006/relationships" xmlns:w="http://schemas.openxmlformats.org/wordprocessingml/2006/main" xmlns:w14="http://schemas.microsoft.com/office/word/2010/wordml" xmlns:w15="http://schemas.microsoft.com/office/word/2012/wordml" xmlns:w16cex="http://schemas.microsoft.com/office/word/2018/wordml/cex" xmlns:w16cid="http://schemas.microsoft.com/office/word/2016/wordml/cid" xmlns:w16="http://schemas.microsoft.com/office/word/2018/wordml" xmlns:w16sdtdh="http://schemas.microsoft.com/office/word/2020/wordml/sdtdatahash" xmlns:w16se="http://schemas.microsoft.com/office/word/2015/wordml/symex" mc:Ignorable="w14 w15 w16se w16cid w16 w16cex w16sdtdh">
   <w:docDefaults>
     <w:rPrDefault>
       <w:rPr>
-        <w:rFonts w:asciiTheme="minorHAnsi" w:hAnsiTheme="minorHAnsi" w:eastAsiaTheme="minorHAnsi" w:cstheme="minorBidi"/>
+        <w:rFonts w:asciiTheme="minorHAnsi" w:eastAsiaTheme="minorHAnsi" w:hAnsiTheme="minorHAnsi" w:cstheme="minorBidi"/>
         <w:sz w:val="22"/>
         <w:szCs w:val="22"/>
         <w:lang w:val="en-US" w:eastAsia="en-US" w:bidi="ar-SA"/>
@@ -2695,14 +2585,14 @@
   <w:latentStyles w:defLockedState="0" w:defUIPriority="99" w:defSemiHidden="0" w:defUnhideWhenUsed="0" w:defQFormat="0" w:count="376">
     <w:lsdException w:name="Normal" w:uiPriority="0" w:qFormat="1"/>
     <w:lsdException w:name="heading 1" w:uiPriority="9" w:qFormat="1"/>
-    <w:lsdException w:name="heading 2" w:uiPriority="9" w:semiHidden="1" w:unhideWhenUsed="1" w:qFormat="1"/>
-    <w:lsdException w:name="heading 3" w:uiPriority="9" w:semiHidden="1" w:unhideWhenUsed="1" w:qFormat="1"/>
-    <w:lsdException w:name="heading 4" w:uiPriority="9" w:semiHidden="1" w:unhideWhenUsed="1" w:qFormat="1"/>
-    <w:lsdException w:name="heading 5" w:uiPriority="9" w:semiHidden="1" w:unhideWhenUsed="1" w:qFormat="1"/>
-    <w:lsdException w:name="heading 6" w:uiPriority="9" w:semiHidden="1" w:unhideWhenUsed="1" w:qFormat="1"/>
-    <w:lsdException w:name="heading 7" w:uiPriority="9" w:semiHidden="1" w:unhideWhenUsed="1" w:qFormat="1"/>
-    <w:lsdException w:name="heading 8" w:uiPriority="9" w:semiHidden="1" w:unhideWhenUsed="1" w:qFormat="1"/>
-    <w:lsdException w:name="heading 9" w:uiPriority="9" w:semiHidden="1" w:unhideWhenUsed="1" w:qFormat="1"/>
+    <w:lsdException w:name="heading 2" w:semiHidden="1" w:uiPriority="9" w:unhideWhenUsed="1" w:qFormat="1"/>
+    <w:lsdException w:name="heading 3" w:semiHidden="1" w:uiPriority="9" w:unhideWhenUsed="1" w:qFormat="1"/>
+    <w:lsdException w:name="heading 4" w:semiHidden="1" w:uiPriority="9" w:unhideWhenUsed="1" w:qFormat="1"/>
+    <w:lsdException w:name="heading 5" w:semiHidden="1" w:uiPriority="9" w:unhideWhenUsed="1" w:qFormat="1"/>
+    <w:lsdException w:name="heading 6" w:semiHidden="1" w:uiPriority="9" w:unhideWhenUsed="1" w:qFormat="1"/>
+    <w:lsdException w:name="heading 7" w:semiHidden="1" w:uiPriority="9" w:unhideWhenUsed="1" w:qFormat="1"/>
+    <w:lsdException w:name="heading 8" w:semiHidden="1" w:uiPriority="9" w:unhideWhenUsed="1" w:qFormat="1"/>
+    <w:lsdException w:name="heading 9" w:semiHidden="1" w:uiPriority="9" w:unhideWhenUsed="1" w:qFormat="1"/>
     <w:lsdException w:name="index 1" w:semiHidden="1" w:unhideWhenUsed="1"/>
     <w:lsdException w:name="index 2" w:semiHidden="1" w:unhideWhenUsed="1"/>
     <w:lsdException w:name="index 3" w:semiHidden="1" w:unhideWhenUsed="1"/>
@@ -2712,22 +2602,22 @@
     <w:lsdException w:name="index 7" w:semiHidden="1" w:unhideWhenUsed="1"/>
     <w:lsdException w:name="index 8" w:semiHidden="1" w:unhideWhenUsed="1"/>
     <w:lsdException w:name="index 9" w:semiHidden="1" w:unhideWhenUsed="1"/>
-    <w:lsdException w:name="toc 1" w:uiPriority="39" w:semiHidden="1" w:unhideWhenUsed="1"/>
-    <w:lsdException w:name="toc 2" w:uiPriority="39" w:semiHidden="1" w:unhideWhenUsed="1"/>
-    <w:lsdException w:name="toc 3" w:uiPriority="39" w:semiHidden="1" w:unhideWhenUsed="1"/>
-    <w:lsdException w:name="toc 4" w:uiPriority="39" w:semiHidden="1" w:unhideWhenUsed="1"/>
-    <w:lsdException w:name="toc 5" w:uiPriority="39" w:semiHidden="1" w:unhideWhenUsed="1"/>
-    <w:lsdException w:name="toc 6" w:uiPriority="39" w:semiHidden="1" w:unhideWhenUsed="1"/>
-    <w:lsdException w:name="toc 7" w:uiPriority="39" w:semiHidden="1" w:unhideWhenUsed="1"/>
-    <w:lsdException w:name="toc 8" w:uiPriority="39" w:semiHidden="1" w:unhideWhenUsed="1"/>
-    <w:lsdException w:name="toc 9" w:uiPriority="39" w:semiHidden="1" w:unhideWhenUsed="1"/>
+    <w:lsdException w:name="toc 1" w:semiHidden="1" w:uiPriority="39" w:unhideWhenUsed="1"/>
+    <w:lsdException w:name="toc 2" w:semiHidden="1" w:uiPriority="39" w:unhideWhenUsed="1"/>
+    <w:lsdException w:name="toc 3" w:semiHidden="1" w:uiPriority="39" w:unhideWhenUsed="1"/>
+    <w:lsdException w:name="toc 4" w:semiHidden="1" w:uiPriority="39" w:unhideWhenUsed="1"/>
+    <w:lsdException w:name="toc 5" w:semiHidden="1" w:uiPriority="39" w:unhideWhenUsed="1"/>
+    <w:lsdException w:name="toc 6" w:semiHidden="1" w:uiPriority="39" w:unhideWhenUsed="1"/>
+    <w:lsdException w:name="toc 7" w:semiHidden="1" w:uiPriority="39" w:unhideWhenUsed="1"/>
+    <w:lsdException w:name="toc 8" w:semiHidden="1" w:uiPriority="39" w:unhideWhenUsed="1"/>
+    <w:lsdException w:name="toc 9" w:semiHidden="1" w:uiPriority="39" w:unhideWhenUsed="1"/>
     <w:lsdException w:name="Normal Indent" w:semiHidden="1" w:unhideWhenUsed="1"/>
     <w:lsdException w:name="footnote text" w:semiHidden="1" w:unhideWhenUsed="1"/>
     <w:lsdException w:name="annotation text" w:semiHidden="1" w:unhideWhenUsed="1"/>
     <w:lsdException w:name="header" w:semiHidden="1" w:unhideWhenUsed="1"/>
     <w:lsdException w:name="footer" w:semiHidden="1" w:unhideWhenUsed="1"/>
     <w:lsdException w:name="index heading" w:semiHidden="1" w:unhideWhenUsed="1"/>
-    <w:lsdException w:name="caption" w:uiPriority="35" w:semiHidden="1" w:unhideWhenUsed="1" w:qFormat="1"/>
+    <w:lsdException w:name="caption" w:semiHidden="1" w:uiPriority="35" w:unhideWhenUsed="1" w:qFormat="1"/>
     <w:lsdException w:name="table of figures" w:semiHidden="1" w:unhideWhenUsed="1"/>
     <w:lsdException w:name="envelope address" w:semiHidden="1" w:unhideWhenUsed="1"/>
     <w:lsdException w:name="envelope return" w:semiHidden="1" w:unhideWhenUsed="1"/>
@@ -2758,7 +2648,7 @@
     <w:lsdException w:name="Title" w:uiPriority="10" w:qFormat="1"/>
     <w:lsdException w:name="Closing" w:semiHidden="1" w:unhideWhenUsed="1"/>
     <w:lsdException w:name="Signature" w:semiHidden="1" w:unhideWhenUsed="1"/>
-    <w:lsdException w:name="Default Paragraph Font" w:uiPriority="1" w:semiHidden="1" w:unhideWhenUsed="1"/>
+    <w:lsdException w:name="Default Paragraph Font" w:semiHidden="1" w:uiPriority="1" w:unhideWhenUsed="1"/>
     <w:lsdException w:name="Body Text" w:semiHidden="1" w:unhideWhenUsed="1"/>
     <w:lsdException w:name="Body Text Indent" w:semiHidden="1" w:unhideWhenUsed="1"/>
     <w:lsdException w:name="List Continue" w:semiHidden="1" w:unhideWhenUsed="1"/>
@@ -2958,8 +2848,8 @@
     <w:lsdException w:name="Subtle Reference" w:uiPriority="31" w:qFormat="1"/>
     <w:lsdException w:name="Intense Reference" w:uiPriority="32" w:qFormat="1"/>
     <w:lsdException w:name="Book Title" w:uiPriority="33" w:qFormat="1"/>
-    <w:lsdException w:name="Bibliography" w:uiPriority="37" w:semiHidden="1" w:unhideWhenUsed="1"/>
-    <w:lsdException w:name="TOC Heading" w:uiPriority="39" w:semiHidden="1" w:unhideWhenUsed="1" w:qFormat="1"/>
+    <w:lsdException w:name="Bibliography" w:semiHidden="1" w:uiPriority="37" w:unhideWhenUsed="1"/>
+    <w:lsdException w:name="TOC Heading" w:semiHidden="1" w:uiPriority="39" w:unhideWhenUsed="1" w:qFormat="1"/>
     <w:lsdException w:name="Plain Table 1" w:uiPriority="41"/>
     <w:lsdException w:name="Plain Table 2" w:uiPriority="42"/>
     <w:lsdException w:name="Plain Table 3" w:uiPriority="43"/>
@@ -3070,21 +2960,21 @@
     <w:lsdException w:name="Unresolved Mention" w:semiHidden="1" w:unhideWhenUsed="1"/>
     <w:lsdException w:name="Smart Link" w:semiHidden="1" w:unhideWhenUsed="1"/>
   </w:latentStyles>
-  <w:style w:type="paragraph" w:styleId="Normal" w:default="1">
+  <w:style w:type="paragraph" w:default="1" w:styleId="Normal">
     <w:name w:val="Normal"/>
     <w:qFormat/>
     <w:rPr>
-      <w:rFonts w:ascii="Times New Roman" w:hAnsi="Times New Roman" w:eastAsia="Times New Roman" w:cs="Times New Roman"/>
+      <w:rFonts w:ascii="Times New Roman" w:eastAsia="Times New Roman" w:hAnsi="Times New Roman" w:cs="Times New Roman"/>
       <w:lang w:val="ms"/>
     </w:rPr>
   </w:style>
-  <w:style w:type="character" w:styleId="DefaultParagraphFont" w:default="1">
+  <w:style w:type="character" w:default="1" w:styleId="DefaultParagraphFont">
     <w:name w:val="Default Paragraph Font"/>
     <w:uiPriority w:val="1"/>
     <w:semiHidden/>
     <w:unhideWhenUsed/>
   </w:style>
-  <w:style w:type="table" w:styleId="TableNormal" w:default="1">
+  <w:style w:type="table" w:default="1" w:styleId="TableNormal">
     <w:name w:val="Normal Table"/>
     <w:uiPriority w:val="99"/>
     <w:semiHidden/>
@@ -3099,7 +2989,7 @@
       </w:tblCellMar>
     </w:tblPr>
   </w:style>
-  <w:style w:type="numbering" w:styleId="NoList" w:default="1">
+  <w:style w:type="numbering" w:default="1" w:styleId="NoList">
     <w:name w:val="No List"/>
     <w:uiPriority w:val="99"/>
     <w:semiHidden/>
@@ -3144,7 +3034,7 @@
       <w:ind w:left="362" w:hanging="360"/>
     </w:pPr>
   </w:style>
-  <w:style w:type="paragraph" w:styleId="TableParagraph" w:customStyle="1">
+  <w:style w:type="paragraph" w:customStyle="1" w:styleId="TableParagraph">
     <w:name w:val="Table Paragraph"/>
     <w:basedOn w:val="Normal"/>
     <w:uiPriority w:val="1"/>
@@ -3157,12 +3047,12 @@
     <w:rsid w:val="009D301C"/>
     <w:tblPr>
       <w:tblBorders>
-        <w:top w:val="single" w:color="auto" w:sz="4" w:space="0"/>
-        <w:left w:val="single" w:color="auto" w:sz="4" w:space="0"/>
-        <w:bottom w:val="single" w:color="auto" w:sz="4" w:space="0"/>
-        <w:right w:val="single" w:color="auto" w:sz="4" w:space="0"/>
-        <w:insideH w:val="single" w:color="auto" w:sz="4" w:space="0"/>
-        <w:insideV w:val="single" w:color="auto" w:sz="4" w:space="0"/>
+        <w:top w:val="single" w:sz="4" w:space="0" w:color="auto"/>
+        <w:left w:val="single" w:sz="4" w:space="0" w:color="auto"/>
+        <w:bottom w:val="single" w:sz="4" w:space="0" w:color="auto"/>
+        <w:right w:val="single" w:sz="4" w:space="0" w:color="auto"/>
+        <w:insideH w:val="single" w:sz="4" w:space="0" w:color="auto"/>
+        <w:insideV w:val="single" w:sz="4" w:space="0" w:color="auto"/>
       </w:tblBorders>
     </w:tblPr>
   </w:style>

</xml_diff>